<commit_message>
Forgot to add DirectX experience
</commit_message>
<xml_diff>
--- a/Files/Siebe Boeckx Resume.docx
+++ b/Files/Siebe Boeckx Resume.docx
@@ -1334,7 +1334,33 @@
         <w:rPr>
           <w:lang w:val="en-GB"/>
         </w:rPr>
-        <w:t>, OpenGL, Vulkan</w:t>
+        <w:t xml:space="preserve">, </w:t>
+      </w:r>
+      <w:r>
+        <w:rPr>
+          <w:lang w:val="en-GB"/>
+        </w:rPr>
+        <w:t xml:space="preserve">OpenGL, </w:t>
+      </w:r>
+    </w:p>
+    <w:p>
+      <w:pPr>
+        <w:ind w:left="142"/>
+        <w:rPr>
+          <w:lang w:val="en-GB"/>
+        </w:rPr>
+      </w:pPr>
+      <w:r>
+        <w:rPr>
+          <w:lang w:val="en-GB"/>
+        </w:rPr>
+        <w:t>DirectX</w:t>
+      </w:r>
+      <w:r>
+        <w:rPr>
+          <w:lang w:val="en-GB"/>
+        </w:rPr>
+        <w:t>, Vulkan</w:t>
       </w:r>
     </w:p>
     <w:sectPr>

</xml_diff>